<commit_message>
docs(rbac): note OPS-006 deterministic-naming + per-AZ CRG scope impact (v2.4)
</commit_message>
<xml_diff>
--- a/docs/guides/acrme_security_and_rbac_guide.docx
+++ b/docs/guides/acrme_security_and_rbac_guide.docx
@@ -2,7 +2,7 @@
 <file path=word/document.xml><?xml version="1.0" encoding="utf-8"?>
 <w:document xmlns:w="http://schemas.openxmlformats.org/wordprocessingml/2006/main" xmlns:m="http://schemas.openxmlformats.org/officeDocument/2006/math" xmlns:r="http://schemas.openxmlformats.org/officeDocument/2006/relationships" xmlns:o="urn:schemas-microsoft-com:office:office" xmlns:v="urn:schemas-microsoft-com:vml" xmlns:w10="urn:schemas-microsoft-com:office:word" xmlns:a="http://schemas.openxmlformats.org/drawingml/2006/main" xmlns:pic="http://schemas.openxmlformats.org/drawingml/2006/picture" xmlns:wp="http://schemas.openxmlformats.org/drawingml/2006/wordprocessingDrawing">
   <w:body>
-    <w:bookmarkStart w:id="42" w:name="acrme-security-and-rbac-guide"/>
+    <w:bookmarkStart w:id="43" w:name="acrme-security-and-rbac-guide"/>
     <w:p>
       <w:pPr>
         <w:pStyle w:val="Heading1"/>
@@ -36,7 +36,7 @@
         <w:t xml:space="preserve"> </w:t>
       </w:r>
       <w:r>
-        <w:t xml:space="preserve">Vishnuvardhan Reddy — August 2026</w:t>
+        <w:t xml:space="preserve">Vishnuvardhan Reddy — August 2026 (reconciled to Requirements Baseline v2.4, 7 September 2026)</w:t>
       </w:r>
       <w:r>
         <w:t xml:space="preserve"> </w:t>
@@ -96,6 +96,119 @@
           <w:rStyle w:val="VerbatimChar"/>
         </w:rPr>
         <w:t xml:space="preserve">docs/rbac/deploy_role_assignments.sh</w:t>
+      </w:r>
+    </w:p>
+    <w:p>
+      <w:pPr>
+        <w:pStyle w:val="BlockText"/>
+      </w:pPr>
+      <w:r>
+        <w:rPr>
+          <w:bCs/>
+          <w:b/>
+        </w:rPr>
+        <w:t xml:space="preserve">v2.4 reconciliation note (7 Sep 2026).</w:t>
+      </w:r>
+      <w:r>
+        <w:t xml:space="preserve"> </w:t>
+      </w:r>
+      <w:r>
+        <w:t xml:space="preserve">The authorization model — least-privilege UAMIs, isolated role-assignment authority, resource-group-scoped assignment, and the G-14 consent posture — is</w:t>
+      </w:r>
+      <w:r>
+        <w:t xml:space="preserve"> </w:t>
+      </w:r>
+      <w:r>
+        <w:rPr>
+          <w:bCs/>
+          <w:b/>
+        </w:rPr>
+        <w:t xml:space="preserve">unchanged</w:t>
+      </w:r>
+      <w:r>
+        <w:t xml:space="preserve"> </w:t>
+      </w:r>
+      <w:r>
+        <w:t xml:space="preserve">by Requirements Baseline v2.4. Two v2.4 items intersect this guide and are addressed inline: (a)</w:t>
+      </w:r>
+      <w:r>
+        <w:t xml:space="preserve"> </w:t>
+      </w:r>
+      <w:r>
+        <w:rPr>
+          <w:bCs/>
+          <w:b/>
+        </w:rPr>
+        <w:t xml:space="preserve">OPS-006/C-12 deterministic naming</w:t>
+      </w:r>
+      <w:r>
+        <w:t xml:space="preserve"> </w:t>
+      </w:r>
+      <w:r>
+        <w:t xml:space="preserve">— RBAC assignment scopes must bind to the deterministic RG/CRG/subscription names produced by OPS-006 (not ad-hoc names); see the new</w:t>
+      </w:r>
+      <w:r>
+        <w:t xml:space="preserve"> </w:t>
+      </w:r>
+      <w:r>
+        <w:rPr>
+          <w:bCs/>
+          <w:b/>
+        </w:rPr>
+        <w:t xml:space="preserve">Section 5.1</w:t>
+      </w:r>
+      <w:r>
+        <w:t xml:space="preserve">. (b)</w:t>
+      </w:r>
+      <w:r>
+        <w:t xml:space="preserve"> </w:t>
+      </w:r>
+      <w:r>
+        <w:rPr>
+          <w:bCs/>
+          <w:b/>
+        </w:rPr>
+        <w:t xml:space="preserve">CAP-023 regional + per-AZ CRG structure</w:t>
+      </w:r>
+      <w:r>
+        <w:t xml:space="preserve"> </w:t>
+      </w:r>
+      <w:r>
+        <w:t xml:space="preserve">— where a role is assigned at CRG scope, the target CRG set now includes the regional CRG (</w:t>
+      </w:r>
+      <w:r>
+        <w:rPr>
+          <w:rStyle w:val="VerbatimChar"/>
+        </w:rPr>
+        <w:t xml:space="preserve">crg-&lt;env&gt;-&lt;region&gt;-reg</w:t>
+      </w:r>
+      <w:r>
+        <w:t xml:space="preserve">) plus the per-AZ CRGs (</w:t>
+      </w:r>
+      <w:r>
+        <w:rPr>
+          <w:rStyle w:val="VerbatimChar"/>
+        </w:rPr>
+        <w:t xml:space="preserve">az1/az2/az3</w:t>
+      </w:r>
+      <w:r>
+        <w:t xml:space="preserve">); assignment stays at the narrowest resource-group/CRG scope as before. The seed-matrix governance (CAP-022) and reactive-discovery auto-create (CAP-024) are performed by the existing</w:t>
+      </w:r>
+      <w:r>
+        <w:t xml:space="preserve"> </w:t>
+      </w:r>
+      <w:r>
+        <w:rPr>
+          <w:bCs/>
+          <w:b/>
+        </w:rPr>
+        <w:t xml:space="preserve">ACRME Capacity Operator</w:t>
+      </w:r>
+      <w:r>
+        <w:t xml:space="preserve"> </w:t>
+      </w:r>
+      <w:r>
+        <w:t xml:space="preserve">identity within its approved provider resource groups — no new engine identity or broader scope is introduced.</w:t>
       </w:r>
     </w:p>
     <w:p>
@@ -4686,7 +4799,7 @@
       </w:r>
     </w:p>
     <w:bookmarkEnd w:id="31"/>
-    <w:bookmarkStart w:id="32" w:name="scope-and-assignment-guidance"/>
+    <w:bookmarkStart w:id="33" w:name="scope-and-assignment-guidance"/>
     <w:p>
       <w:pPr>
         <w:pStyle w:val="Heading2"/>
@@ -5062,21 +5175,108 @@
         <w:t xml:space="preserve">assigns each role to its UAMI at the narrowest scope and prints the resulting assignment IDs for audit capture. Never assign a mutation role at subscription scope when a resource-group scope suffices.</w:t>
       </w:r>
     </w:p>
-    <w:p>
-      <w:r>
-        <w:pict>
-          <v:rect style="width:0;height:1.5pt" o:hralign="center" o:hrstd="t" o:hr="t"/>
-        </w:pict>
-      </w:r>
-    </w:p>
-    <w:bookmarkEnd w:id="32"/>
-    <w:bookmarkStart w:id="33" w:name="Xb2402a4aa526dfcff1cb782baaceff7d8da7fb0"/>
-    <w:p>
-      <w:pPr>
-        <w:pStyle w:val="Heading2"/>
-      </w:pPr>
-      <w:r>
-        <w:t xml:space="preserve">6. Cross-subscription and cross-tenant considerations</w:t>
+    <w:bookmarkStart w:id="32" w:name="X9be59941d2a96c3da435e9b8ecffd1ba08d2ec9"/>
+    <w:p>
+      <w:pPr>
+        <w:pStyle w:val="Heading3"/>
+      </w:pPr>
+      <w:r>
+        <w:t xml:space="preserve">5.1 Deterministic naming and per-AZ CRG scopes (v2.4 — OPS-006, C-12, CAP-023)</w:t>
+      </w:r>
+    </w:p>
+    <w:p>
+      <w:pPr>
+        <w:pStyle w:val="FirstParagraph"/>
+      </w:pPr>
+      <w:r>
+        <w:t xml:space="preserve">Baseline v2.4 pins a</w:t>
+      </w:r>
+      <w:r>
+        <w:t xml:space="preserve"> </w:t>
+      </w:r>
+      <w:r>
+        <w:rPr>
+          <w:bCs/>
+          <w:b/>
+        </w:rPr>
+        <w:t xml:space="preserve">deterministic naming convention</w:t>
+      </w:r>
+      <w:r>
+        <w:t xml:space="preserve"> </w:t>
+      </w:r>
+      <w:r>
+        <w:t xml:space="preserve">for resource groups, CRGs, and subscriptions (</w:t>
+      </w:r>
+      <w:r>
+        <w:rPr>
+          <w:bCs/>
+          <w:b/>
+        </w:rPr>
+        <w:t xml:space="preserve">OPS-006</w:t>
+      </w:r>
+      <w:r>
+        <w:t xml:space="preserve">), backed by a uniqueness</w:t>
+      </w:r>
+      <w:r>
+        <w:t xml:space="preserve"> </w:t>
+      </w:r>
+      <w:r>
+        <w:rPr>
+          <w:bCs/>
+          <w:b/>
+        </w:rPr>
+        <w:t xml:space="preserve">counter (C-12)</w:t>
+      </w:r>
+      <w:r>
+        <w:t xml:space="preserve">. This does not change</w:t>
+      </w:r>
+      <w:r>
+        <w:t xml:space="preserve"> </w:t>
+      </w:r>
+      <w:r>
+        <w:rPr>
+          <w:iCs/>
+          <w:i/>
+        </w:rPr>
+        <w:t xml:space="preserve">what</w:t>
+      </w:r>
+      <w:r>
+        <w:t xml:space="preserve"> </w:t>
+      </w:r>
+      <w:r>
+        <w:t xml:space="preserve">rights are granted or</w:t>
+      </w:r>
+      <w:r>
+        <w:t xml:space="preserve"> </w:t>
+      </w:r>
+      <w:r>
+        <w:rPr>
+          <w:iCs/>
+          <w:i/>
+        </w:rPr>
+        <w:t xml:space="preserve">how narrow</w:t>
+      </w:r>
+      <w:r>
+        <w:t xml:space="preserve"> </w:t>
+      </w:r>
+      <w:r>
+        <w:t xml:space="preserve">the scope is — it changes only how the scope’s</w:t>
+      </w:r>
+      <w:r>
+        <w:t xml:space="preserve"> </w:t>
+      </w:r>
+      <w:r>
+        <w:rPr>
+          <w:bCs/>
+          <w:b/>
+        </w:rPr>
+        <w:t xml:space="preserve">resource identity</w:t>
+      </w:r>
+      <w:r>
+        <w:t xml:space="preserve"> </w:t>
+      </w:r>
+      <w:r>
+        <w:t xml:space="preserve">is derived. Two practical rules:</w:t>
       </w:r>
     </w:p>
     <w:p>
@@ -5092,13 +5292,13 @@
           <w:bCs/>
           <w:b/>
         </w:rPr>
-        <w:t xml:space="preserve">Cross-subscription sharing.</w:t>
-      </w:r>
-      <w:r>
-        <w:t xml:space="preserve"> </w:t>
-      </w:r>
-      <w:r>
-        <w:t xml:space="preserve">CRG sharing lets a provider subscription expose reservations to consumer subscriptions in the same tenant. The engine’s Sharing Operator performs</w:t>
+        <w:t xml:space="preserve">Bind assignment scopes to OPS-006 names, not ad-hoc names.</w:t>
+      </w:r>
+      <w:r>
+        <w:t xml:space="preserve"> </w:t>
+      </w:r>
+      <w:r>
+        <w:t xml:space="preserve">Assignment scopes (RG paths, CRG resource IDs) must reference the deterministic names emitted by OPS-006 rather than hand-picked strings.</w:t>
       </w:r>
       <w:r>
         <w:t xml:space="preserve"> </w:t>
@@ -5107,29 +5307,38 @@
         <w:rPr>
           <w:rStyle w:val="VerbatimChar"/>
         </w:rPr>
-        <w:t xml:space="preserve">share/action</w:t>
-      </w:r>
-      <w:r>
-        <w:t xml:space="preserve"> </w:t>
-      </w:r>
-      <w:r>
-        <w:t xml:space="preserve">on the provider side and grants the consumer identity read+deploy at the CRG scope. No engine identity needs standing rights in the consumer subscription for</w:t>
-      </w:r>
-      <w:r>
-        <w:t xml:space="preserve"> </w:t>
-      </w:r>
-      <w:r>
-        <w:rPr>
-          <w:iCs/>
-          <w:i/>
-        </w:rPr>
-        <w:t xml:space="preserve">deployment</w:t>
-      </w:r>
-      <w:r>
-        <w:t xml:space="preserve"> </w:t>
-      </w:r>
-      <w:r>
-        <w:t xml:space="preserve">— the consumer deploys under its own identity.</w:t>
+        <w:t xml:space="preserve">deploy_role_assignments.sh</w:t>
+      </w:r>
+      <w:r>
+        <w:t xml:space="preserve"> </w:t>
+      </w:r>
+      <w:r>
+        <w:t xml:space="preserve">parameterises the RG/CRG names (</w:t>
+      </w:r>
+      <w:r>
+        <w:rPr>
+          <w:rStyle w:val="VerbatimChar"/>
+        </w:rPr>
+        <w:t xml:space="preserve">PROVIDER_CRG_RG</w:t>
+      </w:r>
+      <w:r>
+        <w:t xml:space="preserve">, etc.) precisely so these can be set to the OPS-006-generated values; keep those variables sourced from the naming output so assignments and resources never drift. Deterministic names also make</w:t>
+      </w:r>
+      <w:r>
+        <w:t xml:space="preserve"> </w:t>
+      </w:r>
+      <w:r>
+        <w:rPr>
+          <w:bCs/>
+          <w:b/>
+        </w:rPr>
+        <w:t xml:space="preserve">audit</w:t>
+      </w:r>
+      <w:r>
+        <w:t xml:space="preserve"> </w:t>
+      </w:r>
+      <w:r>
+        <w:t xml:space="preserve">trivial — the same inputs always yield the same, collision-free scope string.</w:t>
       </w:r>
     </w:p>
     <w:p>
@@ -5145,13 +5354,13 @@
           <w:bCs/>
           <w:b/>
         </w:rPr>
-        <w:t xml:space="preserve">Cross-tenant.</w:t>
-      </w:r>
-      <w:r>
-        <w:t xml:space="preserve"> </w:t>
-      </w:r>
-      <w:r>
-        <w:t xml:space="preserve">Where consumers are in a separate tenant, use</w:t>
+        <w:t xml:space="preserve">CRG-scoped assignments now span a regional + per-AZ CRG set (CAP-023).</w:t>
+      </w:r>
+      <w:r>
+        <w:t xml:space="preserve"> </w:t>
+      </w:r>
+      <w:r>
+        <w:t xml:space="preserve">Each environment carries one</w:t>
       </w:r>
       <w:r>
         <w:t xml:space="preserve"> </w:t>
@@ -5161,65 +5370,175 @@
           <w:bCs/>
           <w:b/>
         </w:rPr>
-        <w:t xml:space="preserve">Azure Lighthouse</w:t>
-      </w:r>
-      <w:r>
-        <w:t xml:space="preserve"> </w:t>
-      </w:r>
-      <w:r>
-        <w:t xml:space="preserve">delegated resource management to project the ACRME reader/operator UAMIs into the customer tenant at a delegated scope, rather than creating guest service principals. Lighthouse delegations are auditable and revocable by the customer, aligning with the G-14 consent posture.</w:t>
-      </w:r>
-    </w:p>
-    <w:p>
-      <w:pPr>
-        <w:numPr>
-          <w:ilvl w:val="0"/>
-          <w:numId w:val="1004"/>
-        </w:numPr>
-        <w:pStyle w:val="Compact"/>
-      </w:pPr>
+        <w:t xml:space="preserve">regional</w:t>
+      </w:r>
+      <w:r>
+        <w:t xml:space="preserve"> </w:t>
+      </w:r>
+      <w:r>
+        <w:t xml:space="preserve">CRG (</w:t>
+      </w:r>
+      <w:r>
+        <w:rPr>
+          <w:rStyle w:val="VerbatimChar"/>
+        </w:rPr>
+        <w:t xml:space="preserve">crg-&lt;env&gt;-&lt;region&gt;-reg</w:t>
+      </w:r>
+      <w:r>
+        <w:t xml:space="preserve">) plus one CRG</w:t>
+      </w:r>
+      <w:r>
+        <w:t xml:space="preserve"> </w:t>
+      </w:r>
       <w:r>
         <w:rPr>
           <w:bCs/>
           <w:b/>
         </w:rPr>
-        <w:t xml:space="preserve">ARG across tenants</w:t>
-      </w:r>
-      <w:r>
-        <w:t xml:space="preserve"> </w:t>
-      </w:r>
-      <w:r>
-        <w:t xml:space="preserve">returns only resources visible to the calling identity’s delegated scope; expect partial fleet views and design reconciliation to treat unseen subscriptions as</w:t>
-      </w:r>
-      <w:r>
-        <w:t xml:space="preserve"> </w:t>
-      </w:r>
-      <w:r>
-        <w:t xml:space="preserve">“</w:t>
-      </w:r>
-      <w:r>
-        <w:t xml:space="preserve">not managed</w:t>
-      </w:r>
-      <w:r>
-        <w:t xml:space="preserve">”</w:t>
-      </w:r>
-      <w:r>
-        <w:t xml:space="preserve"> </w:t>
-      </w:r>
-      <w:r>
-        <w:t xml:space="preserve">rather than</w:t>
-      </w:r>
-      <w:r>
-        <w:t xml:space="preserve"> </w:t>
-      </w:r>
-      <w:r>
-        <w:t xml:space="preserve">“</w:t>
-      </w:r>
-      <w:r>
-        <w:t xml:space="preserve">drifted.</w:t>
-      </w:r>
-      <w:r>
-        <w:t xml:space="preserve">”</w:t>
+        <w:t xml:space="preserve">per availability zone</w:t>
+      </w:r>
+      <w:r>
+        <w:t xml:space="preserve"> </w:t>
+      </w:r>
+      <w:r>
+        <w:t xml:space="preserve">(</w:t>
+      </w:r>
+      <w:r>
+        <w:rPr>
+          <w:rStyle w:val="VerbatimChar"/>
+        </w:rPr>
+        <w:t xml:space="preserve">az1/az2/az3</w:t>
+      </w:r>
+      <w:r>
+        <w:t xml:space="preserve">). Where a role (e.g. </w:t>
+      </w:r>
+      <w:r>
+        <w:rPr>
+          <w:bCs/>
+          <w:b/>
+        </w:rPr>
+        <w:t xml:space="preserve">ACRME Capacity Operator</w:t>
+      </w:r>
+      <w:r>
+        <w:t xml:space="preserve"> </w:t>
+      </w:r>
+      <w:r>
+        <w:t xml:space="preserve">or</w:t>
+      </w:r>
+      <w:r>
+        <w:t xml:space="preserve"> </w:t>
+      </w:r>
+      <w:r>
+        <w:rPr>
+          <w:bCs/>
+          <w:b/>
+        </w:rPr>
+        <w:t xml:space="preserve">ACRME Sharing Operator</w:t>
+      </w:r>
+      <w:r>
+        <w:t xml:space="preserve">) is assigned at CRG scope, enumerate the regional CRG</w:t>
+      </w:r>
+      <w:r>
+        <w:t xml:space="preserve"> </w:t>
+      </w:r>
+      <w:r>
+        <w:rPr>
+          <w:bCs/>
+          <w:b/>
+        </w:rPr>
+        <w:t xml:space="preserve">and</w:t>
+      </w:r>
+      <w:r>
+        <w:t xml:space="preserve"> </w:t>
+      </w:r>
+      <w:r>
+        <w:t xml:space="preserve">the per-AZ CRGs for that environment — still at the narrowest CRG/RG scope, never widened to the subscription. Because the names are deterministic, the per-AZ CRG scope list is derivable from the environment/region inputs without lookup.</w:t>
+      </w:r>
+    </w:p>
+    <w:p>
+      <w:pPr>
+        <w:pStyle w:val="FirstParagraph"/>
+      </w:pPr>
+      <w:r>
+        <w:rPr>
+          <w:bCs/>
+          <w:b/>
+        </w:rPr>
+        <w:t xml:space="preserve">No new identity or broader scope.</w:t>
+      </w:r>
+      <w:r>
+        <w:t xml:space="preserve"> </w:t>
+      </w:r>
+      <w:r>
+        <w:t xml:space="preserve">Seed-matrix governance (</w:t>
+      </w:r>
+      <w:r>
+        <w:rPr>
+          <w:bCs/>
+          <w:b/>
+        </w:rPr>
+        <w:t xml:space="preserve">CAP-022</w:t>
+      </w:r>
+      <w:r>
+        <w:t xml:space="preserve">) and reactive-discovery auto-create (</w:t>
+      </w:r>
+      <w:r>
+        <w:rPr>
+          <w:bCs/>
+          <w:b/>
+        </w:rPr>
+        <w:t xml:space="preserve">CAP-024</w:t>
+      </w:r>
+      <w:r>
+        <w:t xml:space="preserve">) are ordinary CRG/CR create/update operations performed by the existing</w:t>
+      </w:r>
+      <w:r>
+        <w:t xml:space="preserve"> </w:t>
+      </w:r>
+      <w:r>
+        <w:rPr>
+          <w:bCs/>
+          <w:b/>
+        </w:rPr>
+        <w:t xml:space="preserve">ACRME Capacity Operator</w:t>
+      </w:r>
+      <w:r>
+        <w:t xml:space="preserve"> </w:t>
+      </w:r>
+      <w:r>
+        <w:t xml:space="preserve">within its approved provider resource groups. The product-team</w:t>
+      </w:r>
+      <w:r>
+        <w:t xml:space="preserve"> </w:t>
+      </w:r>
+      <w:r>
+        <w:rPr>
+          <w:bCs/>
+          <w:b/>
+        </w:rPr>
+        <w:t xml:space="preserve">budget-governance</w:t>
+      </w:r>
+      <w:r>
+        <w:t xml:space="preserve"> </w:t>
+      </w:r>
+      <w:r>
+        <w:t xml:space="preserve">approval for raising a seed reservation above 0 is an</w:t>
+      </w:r>
+      <w:r>
+        <w:t xml:space="preserve"> </w:t>
+      </w:r>
+      <w:r>
+        <w:rPr>
+          <w:bCs/>
+          <w:b/>
+        </w:rPr>
+        <w:t xml:space="preserve">application-layer</w:t>
+      </w:r>
+      <w:r>
+        <w:t xml:space="preserve"> </w:t>
+      </w:r>
+      <w:r>
+        <w:t xml:space="preserve">gate (an engine-API approval), not an Azure RBAC grant — it does not require any change to the control-plane roles here.</w:t>
       </w:r>
     </w:p>
     <w:p>
@@ -5229,473 +5548,15 @@
         </w:pict>
       </w:r>
     </w:p>
+    <w:bookmarkEnd w:id="32"/>
     <w:bookmarkEnd w:id="33"/>
-    <w:bookmarkStart w:id="34" w:name="deployment"/>
+    <w:bookmarkStart w:id="34" w:name="Xb2402a4aa526dfcff1cb782baaceff7d8da7fb0"/>
     <w:p>
       <w:pPr>
         <w:pStyle w:val="Heading2"/>
       </w:pPr>
       <w:r>
-        <w:t xml:space="preserve">7. Deployment</w:t>
-      </w:r>
-    </w:p>
-    <w:p>
-      <w:pPr>
-        <w:pStyle w:val="SourceCode"/>
-      </w:pPr>
-      <w:r>
-        <w:rPr>
-          <w:rStyle w:val="CommentTok"/>
-        </w:rPr>
-        <w:t xml:space="preserve"># 1. Create/update the five custom role definitions (substitutes placeholders from env)</w:t>
-      </w:r>
-      <w:r>
-        <w:br/>
-      </w:r>
-      <w:r>
-        <w:rPr>
-          <w:rStyle w:val="BuiltInTok"/>
-        </w:rPr>
-        <w:t xml:space="preserve">export</w:t>
-      </w:r>
-      <w:r>
-        <w:rPr>
-          <w:rStyle w:val="NormalTok"/>
-        </w:rPr>
-        <w:t xml:space="preserve"> </w:t>
-      </w:r>
-      <w:r>
-        <w:rPr>
-          <w:rStyle w:val="VariableTok"/>
-        </w:rPr>
-        <w:t xml:space="preserve">SUBSCRIPTION_ID</w:t>
-      </w:r>
-      <w:r>
-        <w:rPr>
-          <w:rStyle w:val="OperatorTok"/>
-        </w:rPr>
-        <w:t xml:space="preserve">=</w:t>
-      </w:r>
-      <w:r>
-        <w:rPr>
-          <w:rStyle w:val="StringTok"/>
-        </w:rPr>
-        <w:t xml:space="preserve">"&lt;sub&gt;"</w:t>
-      </w:r>
-      <w:r>
-        <w:br/>
-      </w:r>
-      <w:r>
-        <w:rPr>
-          <w:rStyle w:val="BuiltInTok"/>
-        </w:rPr>
-        <w:t xml:space="preserve">export</w:t>
-      </w:r>
-      <w:r>
-        <w:rPr>
-          <w:rStyle w:val="NormalTok"/>
-        </w:rPr>
-        <w:t xml:space="preserve"> </w:t>
-      </w:r>
-      <w:r>
-        <w:rPr>
-          <w:rStyle w:val="VariableTok"/>
-        </w:rPr>
-        <w:t xml:space="preserve">PROVIDER_RG_ID</w:t>
-      </w:r>
-      <w:r>
-        <w:rPr>
-          <w:rStyle w:val="OperatorTok"/>
-        </w:rPr>
-        <w:t xml:space="preserve">=</w:t>
-      </w:r>
-      <w:r>
-        <w:rPr>
-          <w:rStyle w:val="StringTok"/>
-        </w:rPr>
-        <w:t xml:space="preserve">"/subscriptions/&lt;sub&gt;/resourceGroups/&lt;rg&gt;"</w:t>
-      </w:r>
-      <w:r>
-        <w:br/>
-      </w:r>
-      <w:r>
-        <w:rPr>
-          <w:rStyle w:val="FunctionTok"/>
-        </w:rPr>
-        <w:t xml:space="preserve">bash</w:t>
-      </w:r>
-      <w:r>
-        <w:rPr>
-          <w:rStyle w:val="NormalTok"/>
-        </w:rPr>
-        <w:t xml:space="preserve"> docs/rbac/deploy_custom_roles.sh</w:t>
-      </w:r>
-      <w:r>
-        <w:br/>
-      </w:r>
-      <w:r>
-        <w:br/>
-      </w:r>
-      <w:r>
-        <w:rPr>
-          <w:rStyle w:val="CommentTok"/>
-        </w:rPr>
-        <w:t xml:space="preserve"># 2. Assign roles to the UAMIs at the narrowest scope (Tier 3 stays commented until G-14)</w:t>
-      </w:r>
-      <w:r>
-        <w:br/>
-      </w:r>
-      <w:r>
-        <w:rPr>
-          <w:rStyle w:val="BuiltInTok"/>
-        </w:rPr>
-        <w:t xml:space="preserve">export</w:t>
-      </w:r>
-      <w:r>
-        <w:rPr>
-          <w:rStyle w:val="NormalTok"/>
-        </w:rPr>
-        <w:t xml:space="preserve"> </w:t>
-      </w:r>
-      <w:r>
-        <w:rPr>
-          <w:rStyle w:val="VariableTok"/>
-        </w:rPr>
-        <w:t xml:space="preserve">READER_UAMI_PRINCIPAL_ID</w:t>
-      </w:r>
-      <w:r>
-        <w:rPr>
-          <w:rStyle w:val="OperatorTok"/>
-        </w:rPr>
-        <w:t xml:space="preserve">=</w:t>
-      </w:r>
-      <w:r>
-        <w:rPr>
-          <w:rStyle w:val="StringTok"/>
-        </w:rPr>
-        <w:t xml:space="preserve">"&lt;...&gt;"</w:t>
-      </w:r>
-      <w:r>
-        <w:rPr>
-          <w:rStyle w:val="NormalTok"/>
-        </w:rPr>
-        <w:t xml:space="preserve">   </w:t>
-      </w:r>
-      <w:r>
-        <w:rPr>
-          <w:rStyle w:val="CommentTok"/>
-        </w:rPr>
-        <w:t xml:space="preserve"># etc. per identity</w:t>
-      </w:r>
-      <w:r>
-        <w:br/>
-      </w:r>
-      <w:r>
-        <w:rPr>
-          <w:rStyle w:val="FunctionTok"/>
-        </w:rPr>
-        <w:t xml:space="preserve">bash</w:t>
-      </w:r>
-      <w:r>
-        <w:rPr>
-          <w:rStyle w:val="NormalTok"/>
-        </w:rPr>
-        <w:t xml:space="preserve"> docs/rbac/deploy_role_assignments.sh</w:t>
-      </w:r>
-    </w:p>
-    <w:p>
-      <w:pPr>
-        <w:pStyle w:val="FirstParagraph"/>
-      </w:pPr>
-      <w:r>
-        <w:t xml:space="preserve">Both scripts are idempotent (</w:t>
-      </w:r>
-      <w:r>
-        <w:rPr>
-          <w:rStyle w:val="VerbatimChar"/>
-        </w:rPr>
-        <w:t xml:space="preserve">az role definition create</w:t>
-      </w:r>
-      <w:r>
-        <w:t xml:space="preserve"> </w:t>
-      </w:r>
-      <w:r>
-        <w:t xml:space="preserve">→ falls back to</w:t>
-      </w:r>
-      <w:r>
-        <w:t xml:space="preserve"> </w:t>
-      </w:r>
-      <w:r>
-        <w:rPr>
-          <w:rStyle w:val="VerbatimChar"/>
-        </w:rPr>
-        <w:t xml:space="preserve">update</w:t>
-      </w:r>
-      <w:r>
-        <w:t xml:space="preserve">;</w:t>
-      </w:r>
-      <w:r>
-        <w:t xml:space="preserve"> </w:t>
-      </w:r>
-      <w:r>
-        <w:rPr>
-          <w:rStyle w:val="VerbatimChar"/>
-        </w:rPr>
-        <w:t xml:space="preserve">az role assignment create</w:t>
-      </w:r>
-      <w:r>
-        <w:t xml:space="preserve"> </w:t>
-      </w:r>
-      <w:r>
-        <w:t xml:space="preserve">is safe to re-run). Capture stdout as the authorization audit record.</w:t>
-      </w:r>
-    </w:p>
-    <w:p>
-      <w:r>
-        <w:pict>
-          <v:rect style="width:0;height:1.5pt" o:hralign="center" o:hrstd="t" o:hr="t"/>
-        </w:pict>
-      </w:r>
-    </w:p>
-    <w:bookmarkEnd w:id="34"/>
-    <w:bookmarkStart w:id="35" w:name="least-privilege-verification"/>
-    <w:p>
-      <w:pPr>
-        <w:pStyle w:val="Heading2"/>
-      </w:pPr>
-      <w:r>
-        <w:t xml:space="preserve">8. Least-privilege verification</w:t>
-      </w:r>
-    </w:p>
-    <w:p>
-      <w:pPr>
-        <w:pStyle w:val="FirstParagraph"/>
-      </w:pPr>
-      <w:r>
-        <w:t xml:space="preserve">After deployment, verify no identity exceeds its intended rights:</w:t>
-      </w:r>
-    </w:p>
-    <w:p>
-      <w:pPr>
-        <w:pStyle w:val="SourceCode"/>
-      </w:pPr>
-      <w:r>
-        <w:rPr>
-          <w:rStyle w:val="CommentTok"/>
-        </w:rPr>
-        <w:t xml:space="preserve"># Enumerate every assignment for an engine UAMI</w:t>
-      </w:r>
-      <w:r>
-        <w:br/>
-      </w:r>
-      <w:r>
-        <w:rPr>
-          <w:rStyle w:val="ExtensionTok"/>
-        </w:rPr>
-        <w:t xml:space="preserve">az</w:t>
-      </w:r>
-      <w:r>
-        <w:rPr>
-          <w:rStyle w:val="NormalTok"/>
-        </w:rPr>
-        <w:t xml:space="preserve"> role assignment list </w:t>
-      </w:r>
-      <w:r>
-        <w:rPr>
-          <w:rStyle w:val="AttributeTok"/>
-        </w:rPr>
-        <w:t xml:space="preserve">--assignee</w:t>
-      </w:r>
-      <w:r>
-        <w:rPr>
-          <w:rStyle w:val="NormalTok"/>
-        </w:rPr>
-        <w:t xml:space="preserve"> </w:t>
-      </w:r>
-      <w:r>
-        <w:rPr>
-          <w:rStyle w:val="OperatorTok"/>
-        </w:rPr>
-        <w:t xml:space="preserve">&lt;</w:t>
-      </w:r>
-      <w:r>
-        <w:rPr>
-          <w:rStyle w:val="NormalTok"/>
-        </w:rPr>
-        <w:t xml:space="preserve">UAMI_PRINCIPAL_ID</w:t>
-      </w:r>
-      <w:r>
-        <w:rPr>
-          <w:rStyle w:val="OperatorTok"/>
-        </w:rPr>
-        <w:t xml:space="preserve">&gt;</w:t>
-      </w:r>
-      <w:r>
-        <w:rPr>
-          <w:rStyle w:val="NormalTok"/>
-        </w:rPr>
-        <w:t xml:space="preserve"> --all </w:t>
-      </w:r>
-      <w:r>
-        <w:rPr>
-          <w:rStyle w:val="AttributeTok"/>
-        </w:rPr>
-        <w:t xml:space="preserve">-o</w:t>
-      </w:r>
-      <w:r>
-        <w:rPr>
-          <w:rStyle w:val="NormalTok"/>
-        </w:rPr>
-        <w:t xml:space="preserve"> table</w:t>
-      </w:r>
-      <w:r>
-        <w:br/>
-      </w:r>
-      <w:r>
-        <w:rPr>
-          <w:rStyle w:val="CommentTok"/>
-        </w:rPr>
-        <w:t xml:space="preserve"># Confirm the definition contains no unexpected Actions</w:t>
-      </w:r>
-      <w:r>
-        <w:br/>
-      </w:r>
-      <w:r>
-        <w:rPr>
-          <w:rStyle w:val="ExtensionTok"/>
-        </w:rPr>
-        <w:t xml:space="preserve">az</w:t>
-      </w:r>
-      <w:r>
-        <w:rPr>
-          <w:rStyle w:val="NormalTok"/>
-        </w:rPr>
-        <w:t xml:space="preserve"> role definition list </w:t>
-      </w:r>
-      <w:r>
-        <w:rPr>
-          <w:rStyle w:val="AttributeTok"/>
-        </w:rPr>
-        <w:t xml:space="preserve">--name</w:t>
-      </w:r>
-      <w:r>
-        <w:rPr>
-          <w:rStyle w:val="NormalTok"/>
-        </w:rPr>
-        <w:t xml:space="preserve"> </w:t>
-      </w:r>
-      <w:r>
-        <w:rPr>
-          <w:rStyle w:val="StringTok"/>
-        </w:rPr>
-        <w:t xml:space="preserve">"ACRME Capacity Operator"</w:t>
-      </w:r>
-      <w:r>
-        <w:rPr>
-          <w:rStyle w:val="NormalTok"/>
-        </w:rPr>
-        <w:t xml:space="preserve"> </w:t>
-      </w:r>
-      <w:r>
-        <w:rPr>
-          <w:rStyle w:val="AttributeTok"/>
-        </w:rPr>
-        <w:t xml:space="preserve">--query</w:t>
-      </w:r>
-      <w:r>
-        <w:rPr>
-          <w:rStyle w:val="NormalTok"/>
-        </w:rPr>
-        <w:t xml:space="preserve"> </w:t>
-      </w:r>
-      <w:r>
-        <w:rPr>
-          <w:rStyle w:val="StringTok"/>
-        </w:rPr>
-        <w:t xml:space="preserve">"[].permissions"</w:t>
-      </w:r>
-      <w:r>
-        <w:rPr>
-          <w:rStyle w:val="NormalTok"/>
-        </w:rPr>
-        <w:t xml:space="preserve"> </w:t>
-      </w:r>
-      <w:r>
-        <w:rPr>
-          <w:rStyle w:val="AttributeTok"/>
-        </w:rPr>
-        <w:t xml:space="preserve">-o</w:t>
-      </w:r>
-      <w:r>
-        <w:rPr>
-          <w:rStyle w:val="NormalTok"/>
-        </w:rPr>
-        <w:t xml:space="preserve"> json</w:t>
-      </w:r>
-    </w:p>
-    <w:p>
-      <w:pPr>
-        <w:pStyle w:val="FirstParagraph"/>
-      </w:pPr>
-      <w:r>
-        <w:t xml:space="preserve">Acceptance: each UAMI holds exactly one ACRME custom role, at the expected scope, with no built-in Owner/Contributor/UAA assignment anywhere in its assignment list.</w:t>
-      </w:r>
-    </w:p>
-    <w:p>
-      <w:r>
-        <w:pict>
-          <v:rect style="width:0;height:1.5pt" o:hralign="center" o:hrstd="t" o:hr="t"/>
-        </w:pict>
-      </w:r>
-    </w:p>
-    <w:bookmarkEnd w:id="35"/>
-    <w:bookmarkStart w:id="36" w:name="g-14-credential-and-consent-model-tier-3"/>
-    <w:p>
-      <w:pPr>
-        <w:pStyle w:val="Heading2"/>
-      </w:pPr>
-      <w:r>
-        <w:t xml:space="preserve">9. G-14 credential and consent model (Tier 3)</w:t>
-      </w:r>
-    </w:p>
-    <w:p>
-      <w:pPr>
-        <w:pStyle w:val="FirstParagraph"/>
-      </w:pPr>
-      <w:r>
-        <w:t xml:space="preserve">Gate</w:t>
-      </w:r>
-      <w:r>
-        <w:t xml:space="preserve"> </w:t>
-      </w:r>
-      <w:r>
-        <w:rPr>
-          <w:bCs/>
-          <w:b/>
-        </w:rPr>
-        <w:t xml:space="preserve">G-14</w:t>
-      </w:r>
-      <w:r>
-        <w:t xml:space="preserve"> </w:t>
-      </w:r>
-      <w:r>
-        <w:t xml:space="preserve">blocks autonomous consumer VM disassociation in production. Closure requires</w:t>
-      </w:r>
-      <w:r>
-        <w:t xml:space="preserve"> </w:t>
-      </w:r>
-      <w:r>
-        <w:rPr>
-          <w:bCs/>
-          <w:b/>
-        </w:rPr>
-        <w:t xml:space="preserve">all</w:t>
-      </w:r>
-      <w:r>
-        <w:t xml:space="preserve"> </w:t>
-      </w:r>
-      <w:r>
-        <w:t xml:space="preserve">of:</w:t>
+        <w:t xml:space="preserve">6. Cross-subscription and cross-tenant considerations</w:t>
       </w:r>
     </w:p>
     <w:p>
@@ -5711,13 +5572,44 @@
           <w:bCs/>
           <w:b/>
         </w:rPr>
-        <w:t xml:space="preserve">Explicit customer consent</w:t>
-      </w:r>
-      <w:r>
-        <w:t xml:space="preserve"> </w:t>
-      </w:r>
-      <w:r>
-        <w:t xml:space="preserve">— a signed authorization naming the exact consumer resource groups and the exact operations (disassociate, and Path-A deallocate/start) the engine may perform.</w:t>
+        <w:t xml:space="preserve">Cross-subscription sharing.</w:t>
+      </w:r>
+      <w:r>
+        <w:t xml:space="preserve"> </w:t>
+      </w:r>
+      <w:r>
+        <w:t xml:space="preserve">CRG sharing lets a provider subscription expose reservations to consumer subscriptions in the same tenant. The engine’s Sharing Operator performs</w:t>
+      </w:r>
+      <w:r>
+        <w:t xml:space="preserve"> </w:t>
+      </w:r>
+      <w:r>
+        <w:rPr>
+          <w:rStyle w:val="VerbatimChar"/>
+        </w:rPr>
+        <w:t xml:space="preserve">share/action</w:t>
+      </w:r>
+      <w:r>
+        <w:t xml:space="preserve"> </w:t>
+      </w:r>
+      <w:r>
+        <w:t xml:space="preserve">on the provider side and grants the consumer identity read+deploy at the CRG scope. No engine identity needs standing rights in the consumer subscription for</w:t>
+      </w:r>
+      <w:r>
+        <w:t xml:space="preserve"> </w:t>
+      </w:r>
+      <w:r>
+        <w:rPr>
+          <w:iCs/>
+          <w:i/>
+        </w:rPr>
+        <w:t xml:space="preserve">deployment</w:t>
+      </w:r>
+      <w:r>
+        <w:t xml:space="preserve"> </w:t>
+      </w:r>
+      <w:r>
+        <w:t xml:space="preserve">— the consumer deploys under its own identity.</w:t>
       </w:r>
     </w:p>
     <w:p>
@@ -5733,40 +5625,13 @@
           <w:bCs/>
           <w:b/>
         </w:rPr>
-        <w:t xml:space="preserve">A narrow custom role</w:t>
-      </w:r>
-      <w:r>
-        <w:t xml:space="preserve"> </w:t>
-      </w:r>
-      <w:r>
-        <w:t xml:space="preserve">—</w:t>
-      </w:r>
-      <w:r>
-        <w:t xml:space="preserve"> </w:t>
-      </w:r>
-      <w:r>
-        <w:rPr>
-          <w:rStyle w:val="VerbatimChar"/>
-        </w:rPr>
-        <w:t xml:space="preserve">ACRME Consumer Compute Operator</w:t>
-      </w:r>
-      <w:r>
-        <w:t xml:space="preserve">, scoped to only the consented resource groups, with the three</w:t>
-      </w:r>
-      <w:r>
-        <w:t xml:space="preserve"> </w:t>
-      </w:r>
-      <w:r>
-        <w:rPr>
-          <w:rStyle w:val="VerbatimChar"/>
-        </w:rPr>
-        <w:t xml:space="preserve">NotActions</w:t>
-      </w:r>
-      <w:r>
-        <w:t xml:space="preserve"> </w:t>
-      </w:r>
-      <w:r>
-        <w:t xml:space="preserve">intact.</w:t>
+        <w:t xml:space="preserve">Cross-tenant.</w:t>
+      </w:r>
+      <w:r>
+        <w:t xml:space="preserve"> </w:t>
+      </w:r>
+      <w:r>
+        <w:t xml:space="preserve">Where consumers are in a separate tenant, use</w:t>
       </w:r>
       <w:r>
         <w:t xml:space="preserve"> </w:t>
@@ -5776,13 +5641,13 @@
           <w:bCs/>
           <w:b/>
         </w:rPr>
-        <w:t xml:space="preserve">Never</w:t>
-      </w:r>
-      <w:r>
-        <w:t xml:space="preserve"> </w:t>
-      </w:r>
-      <w:r>
-        <w:t xml:space="preserve">subscription-wide Virtual Machine Contributor.</w:t>
+        <w:t xml:space="preserve">Azure Lighthouse</w:t>
+      </w:r>
+      <w:r>
+        <w:t xml:space="preserve"> </w:t>
+      </w:r>
+      <w:r>
+        <w:t xml:space="preserve">delegated resource management to project the ACRME reader/operator UAMIs into the customer tenant at a delegated scope, rather than creating guest service principals. Lighthouse delegations are auditable and revocable by the customer, aligning with the G-14 consent posture.</w:t>
       </w:r>
     </w:p>
     <w:p>
@@ -5798,20 +5663,635 @@
           <w:bCs/>
           <w:b/>
         </w:rPr>
-        <w:t xml:space="preserve">Tested revocation</w:t>
-      </w:r>
-      <w:r>
-        <w:t xml:space="preserve"> </w:t>
-      </w:r>
-      <w:r>
-        <w:t xml:space="preserve">— a demonstrated, timed revocation path (remove the role assignment; confirm the engine receives 403 within the token TTL) captured as evidence.</w:t>
+        <w:t xml:space="preserve">ARG across tenants</w:t>
+      </w:r>
+      <w:r>
+        <w:t xml:space="preserve"> </w:t>
+      </w:r>
+      <w:r>
+        <w:t xml:space="preserve">returns only resources visible to the calling identity’s delegated scope; expect partial fleet views and design reconciliation to treat unseen subscriptions as</w:t>
+      </w:r>
+      <w:r>
+        <w:t xml:space="preserve"> </w:t>
+      </w:r>
+      <w:r>
+        <w:t xml:space="preserve">“</w:t>
+      </w:r>
+      <w:r>
+        <w:t xml:space="preserve">not managed</w:t>
+      </w:r>
+      <w:r>
+        <w:t xml:space="preserve">”</w:t>
+      </w:r>
+      <w:r>
+        <w:t xml:space="preserve"> </w:t>
+      </w:r>
+      <w:r>
+        <w:t xml:space="preserve">rather than</w:t>
+      </w:r>
+      <w:r>
+        <w:t xml:space="preserve"> </w:t>
+      </w:r>
+      <w:r>
+        <w:t xml:space="preserve">“</w:t>
+      </w:r>
+      <w:r>
+        <w:t xml:space="preserve">drifted.</w:t>
+      </w:r>
+      <w:r>
+        <w:t xml:space="preserve">”</w:t>
+      </w:r>
+    </w:p>
+    <w:p>
+      <w:r>
+        <w:pict>
+          <v:rect style="width:0;height:1.5pt" o:hralign="center" o:hrstd="t" o:hr="t"/>
+        </w:pict>
+      </w:r>
+    </w:p>
+    <w:bookmarkEnd w:id="34"/>
+    <w:bookmarkStart w:id="35" w:name="deployment"/>
+    <w:p>
+      <w:pPr>
+        <w:pStyle w:val="Heading2"/>
+      </w:pPr>
+      <w:r>
+        <w:t xml:space="preserve">7. Deployment</w:t>
+      </w:r>
+    </w:p>
+    <w:p>
+      <w:pPr>
+        <w:pStyle w:val="SourceCode"/>
+      </w:pPr>
+      <w:r>
+        <w:rPr>
+          <w:rStyle w:val="CommentTok"/>
+        </w:rPr>
+        <w:t xml:space="preserve"># 1. Create/update the five custom role definitions (substitutes placeholders from env)</w:t>
+      </w:r>
+      <w:r>
+        <w:br/>
+      </w:r>
+      <w:r>
+        <w:rPr>
+          <w:rStyle w:val="BuiltInTok"/>
+        </w:rPr>
+        <w:t xml:space="preserve">export</w:t>
+      </w:r>
+      <w:r>
+        <w:rPr>
+          <w:rStyle w:val="NormalTok"/>
+        </w:rPr>
+        <w:t xml:space="preserve"> </w:t>
+      </w:r>
+      <w:r>
+        <w:rPr>
+          <w:rStyle w:val="VariableTok"/>
+        </w:rPr>
+        <w:t xml:space="preserve">SUBSCRIPTION_ID</w:t>
+      </w:r>
+      <w:r>
+        <w:rPr>
+          <w:rStyle w:val="OperatorTok"/>
+        </w:rPr>
+        <w:t xml:space="preserve">=</w:t>
+      </w:r>
+      <w:r>
+        <w:rPr>
+          <w:rStyle w:val="StringTok"/>
+        </w:rPr>
+        <w:t xml:space="preserve">"&lt;sub&gt;"</w:t>
+      </w:r>
+      <w:r>
+        <w:br/>
+      </w:r>
+      <w:r>
+        <w:rPr>
+          <w:rStyle w:val="BuiltInTok"/>
+        </w:rPr>
+        <w:t xml:space="preserve">export</w:t>
+      </w:r>
+      <w:r>
+        <w:rPr>
+          <w:rStyle w:val="NormalTok"/>
+        </w:rPr>
+        <w:t xml:space="preserve"> </w:t>
+      </w:r>
+      <w:r>
+        <w:rPr>
+          <w:rStyle w:val="VariableTok"/>
+        </w:rPr>
+        <w:t xml:space="preserve">PROVIDER_RG_ID</w:t>
+      </w:r>
+      <w:r>
+        <w:rPr>
+          <w:rStyle w:val="OperatorTok"/>
+        </w:rPr>
+        <w:t xml:space="preserve">=</w:t>
+      </w:r>
+      <w:r>
+        <w:rPr>
+          <w:rStyle w:val="StringTok"/>
+        </w:rPr>
+        <w:t xml:space="preserve">"/subscriptions/&lt;sub&gt;/resourceGroups/&lt;rg&gt;"</w:t>
+      </w:r>
+      <w:r>
+        <w:br/>
+      </w:r>
+      <w:r>
+        <w:rPr>
+          <w:rStyle w:val="FunctionTok"/>
+        </w:rPr>
+        <w:t xml:space="preserve">bash</w:t>
+      </w:r>
+      <w:r>
+        <w:rPr>
+          <w:rStyle w:val="NormalTok"/>
+        </w:rPr>
+        <w:t xml:space="preserve"> docs/rbac/deploy_custom_roles.sh</w:t>
+      </w:r>
+      <w:r>
+        <w:br/>
+      </w:r>
+      <w:r>
+        <w:br/>
+      </w:r>
+      <w:r>
+        <w:rPr>
+          <w:rStyle w:val="CommentTok"/>
+        </w:rPr>
+        <w:t xml:space="preserve"># 2. Assign roles to the UAMIs at the narrowest scope (Tier 3 stays commented until G-14)</w:t>
+      </w:r>
+      <w:r>
+        <w:br/>
+      </w:r>
+      <w:r>
+        <w:rPr>
+          <w:rStyle w:val="BuiltInTok"/>
+        </w:rPr>
+        <w:t xml:space="preserve">export</w:t>
+      </w:r>
+      <w:r>
+        <w:rPr>
+          <w:rStyle w:val="NormalTok"/>
+        </w:rPr>
+        <w:t xml:space="preserve"> </w:t>
+      </w:r>
+      <w:r>
+        <w:rPr>
+          <w:rStyle w:val="VariableTok"/>
+        </w:rPr>
+        <w:t xml:space="preserve">READER_UAMI_PRINCIPAL_ID</w:t>
+      </w:r>
+      <w:r>
+        <w:rPr>
+          <w:rStyle w:val="OperatorTok"/>
+        </w:rPr>
+        <w:t xml:space="preserve">=</w:t>
+      </w:r>
+      <w:r>
+        <w:rPr>
+          <w:rStyle w:val="StringTok"/>
+        </w:rPr>
+        <w:t xml:space="preserve">"&lt;...&gt;"</w:t>
+      </w:r>
+      <w:r>
+        <w:rPr>
+          <w:rStyle w:val="NormalTok"/>
+        </w:rPr>
+        <w:t xml:space="preserve">   </w:t>
+      </w:r>
+      <w:r>
+        <w:rPr>
+          <w:rStyle w:val="CommentTok"/>
+        </w:rPr>
+        <w:t xml:space="preserve"># etc. per identity</w:t>
+      </w:r>
+      <w:r>
+        <w:br/>
+      </w:r>
+      <w:r>
+        <w:rPr>
+          <w:rStyle w:val="FunctionTok"/>
+        </w:rPr>
+        <w:t xml:space="preserve">bash</w:t>
+      </w:r>
+      <w:r>
+        <w:rPr>
+          <w:rStyle w:val="NormalTok"/>
+        </w:rPr>
+        <w:t xml:space="preserve"> docs/rbac/deploy_role_assignments.sh</w:t>
+      </w:r>
+    </w:p>
+    <w:p>
+      <w:pPr>
+        <w:pStyle w:val="FirstParagraph"/>
+      </w:pPr>
+      <w:r>
+        <w:t xml:space="preserve">Both scripts are idempotent (</w:t>
+      </w:r>
+      <w:r>
+        <w:rPr>
+          <w:rStyle w:val="VerbatimChar"/>
+        </w:rPr>
+        <w:t xml:space="preserve">az role definition create</w:t>
+      </w:r>
+      <w:r>
+        <w:t xml:space="preserve"> </w:t>
+      </w:r>
+      <w:r>
+        <w:t xml:space="preserve">→ falls back to</w:t>
+      </w:r>
+      <w:r>
+        <w:t xml:space="preserve"> </w:t>
+      </w:r>
+      <w:r>
+        <w:rPr>
+          <w:rStyle w:val="VerbatimChar"/>
+        </w:rPr>
+        <w:t xml:space="preserve">update</w:t>
+      </w:r>
+      <w:r>
+        <w:t xml:space="preserve">;</w:t>
+      </w:r>
+      <w:r>
+        <w:t xml:space="preserve"> </w:t>
+      </w:r>
+      <w:r>
+        <w:rPr>
+          <w:rStyle w:val="VerbatimChar"/>
+        </w:rPr>
+        <w:t xml:space="preserve">az role assignment create</w:t>
+      </w:r>
+      <w:r>
+        <w:t xml:space="preserve"> </w:t>
+      </w:r>
+      <w:r>
+        <w:t xml:space="preserve">is safe to re-run). Capture stdout as the authorization audit record.</w:t>
+      </w:r>
+    </w:p>
+    <w:p>
+      <w:r>
+        <w:pict>
+          <v:rect style="width:0;height:1.5pt" o:hralign="center" o:hrstd="t" o:hr="t"/>
+        </w:pict>
+      </w:r>
+    </w:p>
+    <w:bookmarkEnd w:id="35"/>
+    <w:bookmarkStart w:id="36" w:name="least-privilege-verification"/>
+    <w:p>
+      <w:pPr>
+        <w:pStyle w:val="Heading2"/>
+      </w:pPr>
+      <w:r>
+        <w:t xml:space="preserve">8. Least-privilege verification</w:t>
+      </w:r>
+    </w:p>
+    <w:p>
+      <w:pPr>
+        <w:pStyle w:val="FirstParagraph"/>
+      </w:pPr>
+      <w:r>
+        <w:t xml:space="preserve">After deployment, verify no identity exceeds its intended rights:</w:t>
+      </w:r>
+    </w:p>
+    <w:p>
+      <w:pPr>
+        <w:pStyle w:val="SourceCode"/>
+      </w:pPr>
+      <w:r>
+        <w:rPr>
+          <w:rStyle w:val="CommentTok"/>
+        </w:rPr>
+        <w:t xml:space="preserve"># Enumerate every assignment for an engine UAMI</w:t>
+      </w:r>
+      <w:r>
+        <w:br/>
+      </w:r>
+      <w:r>
+        <w:rPr>
+          <w:rStyle w:val="ExtensionTok"/>
+        </w:rPr>
+        <w:t xml:space="preserve">az</w:t>
+      </w:r>
+      <w:r>
+        <w:rPr>
+          <w:rStyle w:val="NormalTok"/>
+        </w:rPr>
+        <w:t xml:space="preserve"> role assignment list </w:t>
+      </w:r>
+      <w:r>
+        <w:rPr>
+          <w:rStyle w:val="AttributeTok"/>
+        </w:rPr>
+        <w:t xml:space="preserve">--assignee</w:t>
+      </w:r>
+      <w:r>
+        <w:rPr>
+          <w:rStyle w:val="NormalTok"/>
+        </w:rPr>
+        <w:t xml:space="preserve"> </w:t>
+      </w:r>
+      <w:r>
+        <w:rPr>
+          <w:rStyle w:val="OperatorTok"/>
+        </w:rPr>
+        <w:t xml:space="preserve">&lt;</w:t>
+      </w:r>
+      <w:r>
+        <w:rPr>
+          <w:rStyle w:val="NormalTok"/>
+        </w:rPr>
+        <w:t xml:space="preserve">UAMI_PRINCIPAL_ID</w:t>
+      </w:r>
+      <w:r>
+        <w:rPr>
+          <w:rStyle w:val="OperatorTok"/>
+        </w:rPr>
+        <w:t xml:space="preserve">&gt;</w:t>
+      </w:r>
+      <w:r>
+        <w:rPr>
+          <w:rStyle w:val="NormalTok"/>
+        </w:rPr>
+        <w:t xml:space="preserve"> --all </w:t>
+      </w:r>
+      <w:r>
+        <w:rPr>
+          <w:rStyle w:val="AttributeTok"/>
+        </w:rPr>
+        <w:t xml:space="preserve">-o</w:t>
+      </w:r>
+      <w:r>
+        <w:rPr>
+          <w:rStyle w:val="NormalTok"/>
+        </w:rPr>
+        <w:t xml:space="preserve"> table</w:t>
+      </w:r>
+      <w:r>
+        <w:br/>
+      </w:r>
+      <w:r>
+        <w:rPr>
+          <w:rStyle w:val="CommentTok"/>
+        </w:rPr>
+        <w:t xml:space="preserve"># Confirm the definition contains no unexpected Actions</w:t>
+      </w:r>
+      <w:r>
+        <w:br/>
+      </w:r>
+      <w:r>
+        <w:rPr>
+          <w:rStyle w:val="ExtensionTok"/>
+        </w:rPr>
+        <w:t xml:space="preserve">az</w:t>
+      </w:r>
+      <w:r>
+        <w:rPr>
+          <w:rStyle w:val="NormalTok"/>
+        </w:rPr>
+        <w:t xml:space="preserve"> role definition list </w:t>
+      </w:r>
+      <w:r>
+        <w:rPr>
+          <w:rStyle w:val="AttributeTok"/>
+        </w:rPr>
+        <w:t xml:space="preserve">--name</w:t>
+      </w:r>
+      <w:r>
+        <w:rPr>
+          <w:rStyle w:val="NormalTok"/>
+        </w:rPr>
+        <w:t xml:space="preserve"> </w:t>
+      </w:r>
+      <w:r>
+        <w:rPr>
+          <w:rStyle w:val="StringTok"/>
+        </w:rPr>
+        <w:t xml:space="preserve">"ACRME Capacity Operator"</w:t>
+      </w:r>
+      <w:r>
+        <w:rPr>
+          <w:rStyle w:val="NormalTok"/>
+        </w:rPr>
+        <w:t xml:space="preserve"> </w:t>
+      </w:r>
+      <w:r>
+        <w:rPr>
+          <w:rStyle w:val="AttributeTok"/>
+        </w:rPr>
+        <w:t xml:space="preserve">--query</w:t>
+      </w:r>
+      <w:r>
+        <w:rPr>
+          <w:rStyle w:val="NormalTok"/>
+        </w:rPr>
+        <w:t xml:space="preserve"> </w:t>
+      </w:r>
+      <w:r>
+        <w:rPr>
+          <w:rStyle w:val="StringTok"/>
+        </w:rPr>
+        <w:t xml:space="preserve">"[].permissions"</w:t>
+      </w:r>
+      <w:r>
+        <w:rPr>
+          <w:rStyle w:val="NormalTok"/>
+        </w:rPr>
+        <w:t xml:space="preserve"> </w:t>
+      </w:r>
+      <w:r>
+        <w:rPr>
+          <w:rStyle w:val="AttributeTok"/>
+        </w:rPr>
+        <w:t xml:space="preserve">-o</w:t>
+      </w:r>
+      <w:r>
+        <w:rPr>
+          <w:rStyle w:val="NormalTok"/>
+        </w:rPr>
+        <w:t xml:space="preserve"> json</w:t>
+      </w:r>
+    </w:p>
+    <w:p>
+      <w:pPr>
+        <w:pStyle w:val="FirstParagraph"/>
+      </w:pPr>
+      <w:r>
+        <w:t xml:space="preserve">Acceptance: each UAMI holds exactly one ACRME custom role, at the expected scope, with no built-in Owner/Contributor/UAA assignment anywhere in its assignment list.</w:t>
+      </w:r>
+    </w:p>
+    <w:p>
+      <w:r>
+        <w:pict>
+          <v:rect style="width:0;height:1.5pt" o:hralign="center" o:hrstd="t" o:hr="t"/>
+        </w:pict>
+      </w:r>
+    </w:p>
+    <w:bookmarkEnd w:id="36"/>
+    <w:bookmarkStart w:id="37" w:name="g-14-credential-and-consent-model-tier-3"/>
+    <w:p>
+      <w:pPr>
+        <w:pStyle w:val="Heading2"/>
+      </w:pPr>
+      <w:r>
+        <w:t xml:space="preserve">9. G-14 credential and consent model (Tier 3)</w:t>
+      </w:r>
+    </w:p>
+    <w:p>
+      <w:pPr>
+        <w:pStyle w:val="FirstParagraph"/>
+      </w:pPr>
+      <w:r>
+        <w:t xml:space="preserve">Gate</w:t>
+      </w:r>
+      <w:r>
+        <w:t xml:space="preserve"> </w:t>
+      </w:r>
+      <w:r>
+        <w:rPr>
+          <w:bCs/>
+          <w:b/>
+        </w:rPr>
+        <w:t xml:space="preserve">G-14</w:t>
+      </w:r>
+      <w:r>
+        <w:t xml:space="preserve"> </w:t>
+      </w:r>
+      <w:r>
+        <w:t xml:space="preserve">blocks autonomous consumer VM disassociation in production. Closure requires</w:t>
+      </w:r>
+      <w:r>
+        <w:t xml:space="preserve"> </w:t>
+      </w:r>
+      <w:r>
+        <w:rPr>
+          <w:bCs/>
+          <w:b/>
+        </w:rPr>
+        <w:t xml:space="preserve">all</w:t>
+      </w:r>
+      <w:r>
+        <w:t xml:space="preserve"> </w:t>
+      </w:r>
+      <w:r>
+        <w:t xml:space="preserve">of:</w:t>
       </w:r>
     </w:p>
     <w:p>
       <w:pPr>
         <w:numPr>
           <w:ilvl w:val="0"/>
-          <w:numId w:val="1005"/>
+          <w:numId w:val="1006"/>
+        </w:numPr>
+        <w:pStyle w:val="Compact"/>
+      </w:pPr>
+      <w:r>
+        <w:rPr>
+          <w:bCs/>
+          <w:b/>
+        </w:rPr>
+        <w:t xml:space="preserve">Explicit customer consent</w:t>
+      </w:r>
+      <w:r>
+        <w:t xml:space="preserve"> </w:t>
+      </w:r>
+      <w:r>
+        <w:t xml:space="preserve">— a signed authorization naming the exact consumer resource groups and the exact operations (disassociate, and Path-A deallocate/start) the engine may perform.</w:t>
+      </w:r>
+    </w:p>
+    <w:p>
+      <w:pPr>
+        <w:numPr>
+          <w:ilvl w:val="0"/>
+          <w:numId w:val="1006"/>
+        </w:numPr>
+        <w:pStyle w:val="Compact"/>
+      </w:pPr>
+      <w:r>
+        <w:rPr>
+          <w:bCs/>
+          <w:b/>
+        </w:rPr>
+        <w:t xml:space="preserve">A narrow custom role</w:t>
+      </w:r>
+      <w:r>
+        <w:t xml:space="preserve"> </w:t>
+      </w:r>
+      <w:r>
+        <w:t xml:space="preserve">—</w:t>
+      </w:r>
+      <w:r>
+        <w:t xml:space="preserve"> </w:t>
+      </w:r>
+      <w:r>
+        <w:rPr>
+          <w:rStyle w:val="VerbatimChar"/>
+        </w:rPr>
+        <w:t xml:space="preserve">ACRME Consumer Compute Operator</w:t>
+      </w:r>
+      <w:r>
+        <w:t xml:space="preserve">, scoped to only the consented resource groups, with the three</w:t>
+      </w:r>
+      <w:r>
+        <w:t xml:space="preserve"> </w:t>
+      </w:r>
+      <w:r>
+        <w:rPr>
+          <w:rStyle w:val="VerbatimChar"/>
+        </w:rPr>
+        <w:t xml:space="preserve">NotActions</w:t>
+      </w:r>
+      <w:r>
+        <w:t xml:space="preserve"> </w:t>
+      </w:r>
+      <w:r>
+        <w:t xml:space="preserve">intact.</w:t>
+      </w:r>
+      <w:r>
+        <w:t xml:space="preserve"> </w:t>
+      </w:r>
+      <w:r>
+        <w:rPr>
+          <w:bCs/>
+          <w:b/>
+        </w:rPr>
+        <w:t xml:space="preserve">Never</w:t>
+      </w:r>
+      <w:r>
+        <w:t xml:space="preserve"> </w:t>
+      </w:r>
+      <w:r>
+        <w:t xml:space="preserve">subscription-wide Virtual Machine Contributor.</w:t>
+      </w:r>
+    </w:p>
+    <w:p>
+      <w:pPr>
+        <w:numPr>
+          <w:ilvl w:val="0"/>
+          <w:numId w:val="1006"/>
+        </w:numPr>
+        <w:pStyle w:val="Compact"/>
+      </w:pPr>
+      <w:r>
+        <w:rPr>
+          <w:bCs/>
+          <w:b/>
+        </w:rPr>
+        <w:t xml:space="preserve">Tested revocation</w:t>
+      </w:r>
+      <w:r>
+        <w:t xml:space="preserve"> </w:t>
+      </w:r>
+      <w:r>
+        <w:t xml:space="preserve">— a demonstrated, timed revocation path (remove the role assignment; confirm the engine receives 403 within the token TTL) captured as evidence.</w:t>
+      </w:r>
+    </w:p>
+    <w:p>
+      <w:pPr>
+        <w:numPr>
+          <w:ilvl w:val="0"/>
+          <w:numId w:val="1006"/>
         </w:numPr>
         <w:pStyle w:val="Compact"/>
       </w:pPr>
@@ -5874,8 +6354,8 @@
         </w:pict>
       </w:r>
     </w:p>
-    <w:bookmarkEnd w:id="36"/>
-    <w:bookmarkStart w:id="37" w:name="separation-of-duties"/>
+    <w:bookmarkEnd w:id="37"/>
+    <w:bookmarkStart w:id="38" w:name="separation-of-duties"/>
     <w:p>
       <w:pPr>
         <w:pStyle w:val="Heading2"/>
@@ -6309,112 +6789,14 @@
         </w:pict>
       </w:r>
     </w:p>
-    <w:bookmarkEnd w:id="37"/>
-    <w:bookmarkStart w:id="38" w:name="break-glass-and-revocation"/>
+    <w:bookmarkEnd w:id="38"/>
+    <w:bookmarkStart w:id="39" w:name="break-glass-and-revocation"/>
     <w:p>
       <w:pPr>
         <w:pStyle w:val="Heading2"/>
       </w:pPr>
       <w:r>
         <w:t xml:space="preserve">11. Break-glass and revocation</w:t>
-      </w:r>
-    </w:p>
-    <w:p>
-      <w:pPr>
-        <w:numPr>
-          <w:ilvl w:val="0"/>
-          <w:numId w:val="1006"/>
-        </w:numPr>
-        <w:pStyle w:val="Compact"/>
-      </w:pPr>
-      <w:r>
-        <w:rPr>
-          <w:bCs/>
-          <w:b/>
-        </w:rPr>
-        <w:t xml:space="preserve">Break-glass</w:t>
-      </w:r>
-      <w:r>
-        <w:t xml:space="preserve"> </w:t>
-      </w:r>
-      <w:r>
-        <w:t xml:space="preserve">capacity operations use a separately-approved, time-boxed Privileged Identity Management (PIM) activation of the relevant ACRME custom role by a human operator — not a standing assignment and not a broader built-in role. Every activation is logged.</w:t>
-      </w:r>
-    </w:p>
-    <w:p>
-      <w:pPr>
-        <w:numPr>
-          <w:ilvl w:val="0"/>
-          <w:numId w:val="1006"/>
-        </w:numPr>
-        <w:pStyle w:val="Compact"/>
-      </w:pPr>
-      <w:r>
-        <w:rPr>
-          <w:bCs/>
-          <w:b/>
-        </w:rPr>
-        <w:t xml:space="preserve">Kill switch.</w:t>
-      </w:r>
-      <w:r>
-        <w:t xml:space="preserve"> </w:t>
-      </w:r>
-      <w:r>
-        <w:t xml:space="preserve">Removing a UAMI’s single role assignment fully revokes that function within the token TTL; because there are no stored secrets, there is nothing else to rotate or revoke.</w:t>
-      </w:r>
-    </w:p>
-    <w:p>
-      <w:pPr>
-        <w:numPr>
-          <w:ilvl w:val="0"/>
-          <w:numId w:val="1006"/>
-        </w:numPr>
-        <w:pStyle w:val="Compact"/>
-      </w:pPr>
-      <w:r>
-        <w:rPr>
-          <w:bCs/>
-          <w:b/>
-        </w:rPr>
-        <w:t xml:space="preserve">Tier 3 emergency stop.</w:t>
-      </w:r>
-      <w:r>
-        <w:t xml:space="preserve"> </w:t>
-      </w:r>
-      <w:r>
-        <w:t xml:space="preserve">Setting</w:t>
-      </w:r>
-      <w:r>
-        <w:t xml:space="preserve"> </w:t>
-      </w:r>
-      <w:r>
-        <w:rPr>
-          <w:rStyle w:val="VerbatimChar"/>
-        </w:rPr>
-        <w:t xml:space="preserve">engine_mode</w:t>
-      </w:r>
-      <w:r>
-        <w:t xml:space="preserve"> </w:t>
-      </w:r>
-      <w:r>
-        <w:t xml:space="preserve">out of the Tier-3-enabled state disables consumer VM mutation at the application layer even before the Azure assignment is removed — defense in depth.</w:t>
-      </w:r>
-    </w:p>
-    <w:p>
-      <w:r>
-        <w:pict>
-          <v:rect style="width:0;height:1.5pt" o:hralign="center" o:hrstd="t" o:hr="t"/>
-        </w:pict>
-      </w:r>
-    </w:p>
-    <w:bookmarkEnd w:id="38"/>
-    <w:bookmarkStart w:id="39" w:name="secret-free-and-data-plane-posture"/>
-    <w:p>
-      <w:pPr>
-        <w:pStyle w:val="Heading2"/>
-      </w:pPr>
-      <w:r>
-        <w:t xml:space="preserve">12. Secret-free and data-plane posture</w:t>
       </w:r>
     </w:p>
     <w:p>
@@ -6430,13 +6812,13 @@
           <w:bCs/>
           <w:b/>
         </w:rPr>
-        <w:t xml:space="preserve">Control plane:</w:t>
-      </w:r>
-      <w:r>
-        <w:t xml:space="preserve"> </w:t>
-      </w:r>
-      <w:r>
-        <w:t xml:space="preserve">managed identity only; no client secrets or certificates in code, config, key vault references for engine auth, or CI.</w:t>
+        <w:t xml:space="preserve">Break-glass</w:t>
+      </w:r>
+      <w:r>
+        <w:t xml:space="preserve"> </w:t>
+      </w:r>
+      <w:r>
+        <w:t xml:space="preserve">capacity operations use a separately-approved, time-boxed Privileged Identity Management (PIM) activation of the relevant ACRME custom role by a human operator — not a standing assignment and not a broader built-in role. Every activation is logged.</w:t>
       </w:r>
     </w:p>
     <w:p>
@@ -6452,47 +6834,13 @@
           <w:bCs/>
           <w:b/>
         </w:rPr>
-        <w:t xml:space="preserve">Data plane:</w:t>
-      </w:r>
-      <w:r>
-        <w:t xml:space="preserve"> </w:t>
-      </w:r>
-      <w:r>
-        <w:t xml:space="preserve">Cosmos DB and Redis are accessed via the engine’s managed identity using Azure RBAC</w:t>
-      </w:r>
-      <w:r>
-        <w:t xml:space="preserve"> </w:t>
-      </w:r>
-      <w:r>
-        <w:rPr>
-          <w:bCs/>
-          <w:b/>
-        </w:rPr>
-        <w:t xml:space="preserve">data</w:t>
-      </w:r>
-      <w:r>
-        <w:t xml:space="preserve"> </w:t>
-      </w:r>
-      <w:r>
-        <w:t xml:space="preserve">roles (e.g., Cosmos DB Built-in Data Contributor) scoped to the ACRME database — not account keys. This keeps the</w:t>
-      </w:r>
-      <w:r>
-        <w:t xml:space="preserve"> </w:t>
-      </w:r>
-      <w:r>
-        <w:t xml:space="preserve">“</w:t>
-      </w:r>
-      <w:r>
-        <w:t xml:space="preserve">no stored secrets</w:t>
-      </w:r>
-      <w:r>
-        <w:t xml:space="preserve">”</w:t>
-      </w:r>
-      <w:r>
-        <w:t xml:space="preserve"> </w:t>
-      </w:r>
-      <w:r>
-        <w:t xml:space="preserve">invariant end to end.</w:t>
+        <w:t xml:space="preserve">Kill switch.</w:t>
+      </w:r>
+      <w:r>
+        <w:t xml:space="preserve"> </w:t>
+      </w:r>
+      <w:r>
+        <w:t xml:space="preserve">Removing a UAMI’s single role assignment fully revokes that function within the token TTL; because there are no stored secrets, there is nothing else to rotate or revoke.</w:t>
       </w:r>
     </w:p>
     <w:p>
@@ -6508,13 +6856,28 @@
           <w:bCs/>
           <w:b/>
         </w:rPr>
-        <w:t xml:space="preserve">Tokens:</w:t>
-      </w:r>
-      <w:r>
-        <w:t xml:space="preserve"> </w:t>
-      </w:r>
-      <w:r>
-        <w:t xml:space="preserve">all Azure tokens are short-lived and acquired at runtime; nothing durable is persisted.</w:t>
+        <w:t xml:space="preserve">Tier 3 emergency stop.</w:t>
+      </w:r>
+      <w:r>
+        <w:t xml:space="preserve"> </w:t>
+      </w:r>
+      <w:r>
+        <w:t xml:space="preserve">Setting</w:t>
+      </w:r>
+      <w:r>
+        <w:t xml:space="preserve"> </w:t>
+      </w:r>
+      <w:r>
+        <w:rPr>
+          <w:rStyle w:val="VerbatimChar"/>
+        </w:rPr>
+        <w:t xml:space="preserve">engine_mode</w:t>
+      </w:r>
+      <w:r>
+        <w:t xml:space="preserve"> </w:t>
+      </w:r>
+      <w:r>
+        <w:t xml:space="preserve">out of the Tier-3-enabled state disables consumer VM mutation at the application layer even before the Azure assignment is removed — defense in depth.</w:t>
       </w:r>
     </w:p>
     <w:p>
@@ -6525,21 +6888,73 @@
       </w:r>
     </w:p>
     <w:bookmarkEnd w:id="39"/>
-    <w:bookmarkStart w:id="40" w:name="X99c93ffb0e534e3824bfed99e3db90869045453"/>
+    <w:bookmarkStart w:id="40" w:name="secret-free-and-data-plane-posture"/>
     <w:p>
       <w:pPr>
         <w:pStyle w:val="Heading2"/>
       </w:pPr>
       <w:r>
-        <w:t xml:space="preserve">13. Mapping to the production-readiness RBAC matrix</w:t>
-      </w:r>
-    </w:p>
-    <w:p>
-      <w:pPr>
-        <w:pStyle w:val="FirstParagraph"/>
-      </w:pPr>
-      <w:r>
-        <w:t xml:space="preserve">This guide operationalizes the RBAC matrix in the Production Readiness Review (Section 36). The five UAMIs here correspond 1:1 to the</w:t>
+        <w:t xml:space="preserve">12. Secret-free and data-plane posture</w:t>
+      </w:r>
+    </w:p>
+    <w:p>
+      <w:pPr>
+        <w:numPr>
+          <w:ilvl w:val="0"/>
+          <w:numId w:val="1008"/>
+        </w:numPr>
+        <w:pStyle w:val="Compact"/>
+      </w:pPr>
+      <w:r>
+        <w:rPr>
+          <w:bCs/>
+          <w:b/>
+        </w:rPr>
+        <w:t xml:space="preserve">Control plane:</w:t>
+      </w:r>
+      <w:r>
+        <w:t xml:space="preserve"> </w:t>
+      </w:r>
+      <w:r>
+        <w:t xml:space="preserve">managed identity only; no client secrets or certificates in code, config, key vault references for engine auth, or CI.</w:t>
+      </w:r>
+    </w:p>
+    <w:p>
+      <w:pPr>
+        <w:numPr>
+          <w:ilvl w:val="0"/>
+          <w:numId w:val="1008"/>
+        </w:numPr>
+        <w:pStyle w:val="Compact"/>
+      </w:pPr>
+      <w:r>
+        <w:rPr>
+          <w:bCs/>
+          <w:b/>
+        </w:rPr>
+        <w:t xml:space="preserve">Data plane:</w:t>
+      </w:r>
+      <w:r>
+        <w:t xml:space="preserve"> </w:t>
+      </w:r>
+      <w:r>
+        <w:t xml:space="preserve">Cosmos DB and Redis are accessed via the engine’s managed identity using Azure RBAC</w:t>
+      </w:r>
+      <w:r>
+        <w:t xml:space="preserve"> </w:t>
+      </w:r>
+      <w:r>
+        <w:rPr>
+          <w:bCs/>
+          <w:b/>
+        </w:rPr>
+        <w:t xml:space="preserve">data</w:t>
+      </w:r>
+      <w:r>
+        <w:t xml:space="preserve"> </w:t>
+      </w:r>
+      <w:r>
+        <w:t xml:space="preserve">roles (e.g., Cosmos DB Built-in Data Contributor) scoped to the ACRME database — not account keys. This keeps the</w:t>
       </w:r>
       <w:r>
         <w:t xml:space="preserve"> </w:t>
@@ -6548,7 +6963,7 @@
         <w:t xml:space="preserve">“</w:t>
       </w:r>
       <w:r>
-        <w:t xml:space="preserve">ACRME * UAMI</w:t>
+        <w:t xml:space="preserve">no stored secrets</w:t>
       </w:r>
       <w:r>
         <w:t xml:space="preserve">”</w:t>
@@ -6557,25 +6972,29 @@
         <w:t xml:space="preserve"> </w:t>
       </w:r>
       <w:r>
-        <w:t xml:space="preserve">rows; the four app roles correspond to the DR Operator / Emergency Operator / Policy Admin / Auditor rows. The G-14 closure model here is the concrete realization of that document’s</w:t>
-      </w:r>
-      <w:r>
-        <w:t xml:space="preserve"> </w:t>
-      </w:r>
-      <w:r>
-        <w:t xml:space="preserve">“</w:t>
-      </w:r>
-      <w:r>
-        <w:t xml:space="preserve">customer-consented UAMI with resource-group-scoped custom rights</w:t>
-      </w:r>
-      <w:r>
-        <w:t xml:space="preserve">”</w:t>
-      </w:r>
-      <w:r>
-        <w:t xml:space="preserve"> </w:t>
-      </w:r>
-      <w:r>
-        <w:t xml:space="preserve">guidance.</w:t>
+        <w:t xml:space="preserve">invariant end to end.</w:t>
+      </w:r>
+    </w:p>
+    <w:p>
+      <w:pPr>
+        <w:numPr>
+          <w:ilvl w:val="0"/>
+          <w:numId w:val="1008"/>
+        </w:numPr>
+        <w:pStyle w:val="Compact"/>
+      </w:pPr>
+      <w:r>
+        <w:rPr>
+          <w:bCs/>
+          <w:b/>
+        </w:rPr>
+        <w:t xml:space="preserve">Tokens:</w:t>
+      </w:r>
+      <w:r>
+        <w:t xml:space="preserve"> </w:t>
+      </w:r>
+      <w:r>
+        <w:t xml:space="preserve">all Azure tokens are short-lived and acquired at runtime; nothing durable is persisted.</w:t>
       </w:r>
     </w:p>
     <w:p>
@@ -6586,12 +7005,73 @@
       </w:r>
     </w:p>
     <w:bookmarkEnd w:id="40"/>
-    <w:bookmarkStart w:id="41" w:name="summary"/>
+    <w:bookmarkStart w:id="41" w:name="X99c93ffb0e534e3824bfed99e3db90869045453"/>
     <w:p>
       <w:pPr>
         <w:pStyle w:val="Heading2"/>
       </w:pPr>
       <w:r>
+        <w:t xml:space="preserve">13. Mapping to the production-readiness RBAC matrix</w:t>
+      </w:r>
+    </w:p>
+    <w:p>
+      <w:pPr>
+        <w:pStyle w:val="FirstParagraph"/>
+      </w:pPr>
+      <w:r>
+        <w:t xml:space="preserve">This guide operationalizes the RBAC matrix in the Production Readiness Review (Section 36). The five UAMIs here correspond 1:1 to the</w:t>
+      </w:r>
+      <w:r>
+        <w:t xml:space="preserve"> </w:t>
+      </w:r>
+      <w:r>
+        <w:t xml:space="preserve">“</w:t>
+      </w:r>
+      <w:r>
+        <w:t xml:space="preserve">ACRME * UAMI</w:t>
+      </w:r>
+      <w:r>
+        <w:t xml:space="preserve">”</w:t>
+      </w:r>
+      <w:r>
+        <w:t xml:space="preserve"> </w:t>
+      </w:r>
+      <w:r>
+        <w:t xml:space="preserve">rows; the four app roles correspond to the DR Operator / Emergency Operator / Policy Admin / Auditor rows. The G-14 closure model here is the concrete realization of that document’s</w:t>
+      </w:r>
+      <w:r>
+        <w:t xml:space="preserve"> </w:t>
+      </w:r>
+      <w:r>
+        <w:t xml:space="preserve">“</w:t>
+      </w:r>
+      <w:r>
+        <w:t xml:space="preserve">customer-consented UAMI with resource-group-scoped custom rights</w:t>
+      </w:r>
+      <w:r>
+        <w:t xml:space="preserve">”</w:t>
+      </w:r>
+      <w:r>
+        <w:t xml:space="preserve"> </w:t>
+      </w:r>
+      <w:r>
+        <w:t xml:space="preserve">guidance.</w:t>
+      </w:r>
+    </w:p>
+    <w:p>
+      <w:r>
+        <w:pict>
+          <v:rect style="width:0;height:1.5pt" o:hralign="center" o:hrstd="t" o:hr="t"/>
+        </w:pict>
+      </w:r>
+    </w:p>
+    <w:bookmarkEnd w:id="41"/>
+    <w:bookmarkStart w:id="42" w:name="summary"/>
+    <w:p>
+      <w:pPr>
+        <w:pStyle w:val="Heading2"/>
+      </w:pPr>
+      <w:r>
         <w:t xml:space="preserve">14. Summary</w:t>
       </w:r>
     </w:p>
@@ -6633,8 +7113,8 @@
         <w:t xml:space="preserve">make this model directly deployable and auditable.</w:t>
       </w:r>
     </w:p>
-    <w:bookmarkEnd w:id="41"/>
     <w:bookmarkEnd w:id="42"/>
+    <w:bookmarkEnd w:id="43"/>
     <w:sectPr/>
   </w:body>
 </w:document>
@@ -6915,9 +7395,6 @@
     <w:abstractNumId w:val="991"/>
   </w:num>
   <w:num w:numId="1004">
-    <w:abstractNumId w:val="991"/>
-  </w:num>
-  <w:num w:numId="1005">
     <w:abstractNumId w:val="99411"/>
     <w:lvlOverride w:ilvl="0">
       <w:startOverride w:val="1"/>
@@ -6947,10 +7424,43 @@
       <w:startOverride w:val="1"/>
     </w:lvlOverride>
   </w:num>
-  <w:num w:numId="1006">
+  <w:num w:numId="1005">
     <w:abstractNumId w:val="991"/>
   </w:num>
+  <w:num w:numId="1006">
+    <w:abstractNumId w:val="99411"/>
+    <w:lvlOverride w:ilvl="0">
+      <w:startOverride w:val="1"/>
+    </w:lvlOverride>
+    <w:lvlOverride w:ilvl="1">
+      <w:startOverride w:val="1"/>
+    </w:lvlOverride>
+    <w:lvlOverride w:ilvl="2">
+      <w:startOverride w:val="1"/>
+    </w:lvlOverride>
+    <w:lvlOverride w:ilvl="3">
+      <w:startOverride w:val="1"/>
+    </w:lvlOverride>
+    <w:lvlOverride w:ilvl="4">
+      <w:startOverride w:val="1"/>
+    </w:lvlOverride>
+    <w:lvlOverride w:ilvl="5">
+      <w:startOverride w:val="1"/>
+    </w:lvlOverride>
+    <w:lvlOverride w:ilvl="6">
+      <w:startOverride w:val="1"/>
+    </w:lvlOverride>
+    <w:lvlOverride w:ilvl="7">
+      <w:startOverride w:val="1"/>
+    </w:lvlOverride>
+    <w:lvlOverride w:ilvl="8">
+      <w:startOverride w:val="1"/>
+    </w:lvlOverride>
+  </w:num>
   <w:num w:numId="1007">
+    <w:abstractNumId w:val="991"/>
+  </w:num>
+  <w:num w:numId="1008">
     <w:abstractNumId w:val="991"/>
   </w:num>
 </w:numbering>

</xml_diff>